<commit_message>
Add macOS installation guide and new JavaScript asset file
- Created HOW_TO_OPEN_MAC.txt to provide instructions for resolving "App is damaged" warnings on macOS.
- Added three methods for users to install the application safely.
- Introduced a new JavaScript asset file index-B68kOY_K.js for the Android app.
</commit_message>
<xml_diff>
--- a/android-app/app/src/main/assets/templates/template.docx
+++ b/android-app/app/src/main/assets/templates/template.docx
@@ -35,7 +35,7 @@
           <w:b/>
           <w:sz w:val="32"/>
         </w:rPr>
-        <w:t>นายอดิศร ละลี</w:t>
+        <w:t>( ชื่อ-สกุล ผู้ปฏิบัติงาน )</w:t>
       </w:r>
     </w:p>
     <w:p/>
@@ -115,7 +115,7 @@
         <w:br/>
       </w:r>
       <w:r>
-        <w:t>( นายอดิศร ละลี )</w:t>
+        <w:t>( ( ชื่อ-สกุล ผู้ปฏิบัติงาน ) )</w:t>
         <w:br/>
       </w:r>
       <w:r>

</xml_diff>